<commit_message>
Actualizo archivo Word con correcciones
</commit_message>
<xml_diff>
--- a/Actividad 3.1 Resumen_Eddi Castillo_Verano26.docx
+++ b/Actividad 3.1 Resumen_Eddi Castillo_Verano26.docx
@@ -20,7 +20,7 @@
           <w:sz w:val="20"/>
         </w:rPr>
         <w:drawing>
-          <wp:anchor distT="0" distB="0" distL="114300" distR="114300" simplePos="0" relativeHeight="251658240" behindDoc="0" locked="0" layoutInCell="1" allowOverlap="1" wp14:anchorId="35A9F5C2" wp14:editId="0C7CD221">
+          <wp:anchor distT="0" distB="0" distL="114300" distR="114300" simplePos="0" relativeHeight="251658240" behindDoc="0" locked="0" layoutInCell="1" allowOverlap="1" wp14:anchorId="35A9F5C2" wp14:editId="342D7507">
             <wp:simplePos x="0" y="0"/>
             <wp:positionH relativeFrom="margin">
               <wp:align>left</wp:align>
@@ -217,21 +217,229 @@
         </w:rPr>
         <w:t xml:space="preserve"> </w:t>
       </w:r>
+      <w:proofErr w:type="spellStart"/>
       <w:r>
         <w:rPr>
           <w:rFonts w:ascii="Arial" w:hAnsi="Arial" w:cs="Arial"/>
           <w:b/>
           <w:sz w:val="22"/>
         </w:rPr>
-        <w:t>Fundamentos</w:t>
+        <w:t>Topicos</w:t>
+      </w:r>
+      <w:proofErr w:type="spellEnd"/>
+      <w:r>
+        <w:rPr>
+          <w:rFonts w:ascii="Arial" w:hAnsi="Arial" w:cs="Arial"/>
+          <w:b/>
+          <w:sz w:val="22"/>
+        </w:rPr>
+        <w:t xml:space="preserve"> de </w:t>
+      </w:r>
+      <w:proofErr w:type="spellStart"/>
+      <w:r>
+        <w:rPr>
+          <w:rFonts w:ascii="Arial" w:hAnsi="Arial" w:cs="Arial"/>
+          <w:b/>
+          <w:sz w:val="22"/>
+        </w:rPr>
+        <w:t>Programacion</w:t>
+      </w:r>
+      <w:proofErr w:type="spellEnd"/>
+      <w:r>
+        <w:rPr>
+          <w:rFonts w:ascii="Arial" w:hAnsi="Arial" w:cs="Arial"/>
+          <w:b/>
+          <w:sz w:val="22"/>
+        </w:rPr>
+        <w:t xml:space="preserve"> Web</w:t>
+      </w:r>
+    </w:p>
+    <w:p>
+      <w:pPr>
+        <w:pStyle w:val="Textoindependiente"/>
+        <w:spacing w:before="24"/>
+        <w:rPr>
+          <w:rFonts w:ascii="Arial" w:hAnsi="Arial" w:cs="Arial"/>
+          <w:b/>
+          <w:sz w:val="24"/>
+        </w:rPr>
+      </w:pPr>
+    </w:p>
+    <w:p>
+      <w:pPr>
+        <w:spacing w:line="499" w:lineRule="auto"/>
+        <w:ind w:left="523" w:right="1751"/>
+        <w:rPr>
+          <w:rFonts w:ascii="Arial" w:hAnsi="Arial" w:cs="Arial"/>
+          <w:b/>
+          <w:sz w:val="24"/>
+        </w:rPr>
+      </w:pPr>
+      <w:r>
+        <w:rPr>
+          <w:rFonts w:ascii="Arial" w:hAnsi="Arial" w:cs="Arial"/>
+          <w:b/>
+          <w:spacing w:val="-2"/>
+          <w:sz w:val="24"/>
+        </w:rPr>
+        <w:t>Especialidad:</w:t>
       </w:r>
       <w:r>
         <w:rPr>
           <w:rFonts w:ascii="Arial" w:hAnsi="Arial" w:cs="Arial"/>
           <w:b/>
           <w:spacing w:val="-15"/>
+          <w:sz w:val="24"/>
+        </w:rPr>
+        <w:t xml:space="preserve"> </w:t>
+      </w:r>
+      <w:r>
+        <w:rPr>
+          <w:rFonts w:ascii="Arial" w:hAnsi="Arial" w:cs="Arial"/>
+          <w:b/>
+          <w:spacing w:val="-2"/>
+          <w:sz w:val="24"/>
+        </w:rPr>
+        <w:t>Ingeniería</w:t>
+      </w:r>
+      <w:r>
+        <w:rPr>
+          <w:rFonts w:ascii="Arial" w:hAnsi="Arial" w:cs="Arial"/>
+          <w:b/>
+          <w:spacing w:val="-11"/>
+          <w:sz w:val="24"/>
+        </w:rPr>
+        <w:t xml:space="preserve"> </w:t>
+      </w:r>
+      <w:r>
+        <w:rPr>
+          <w:rFonts w:ascii="Arial" w:hAnsi="Arial" w:cs="Arial"/>
+          <w:b/>
+          <w:spacing w:val="-2"/>
+          <w:sz w:val="24"/>
+        </w:rPr>
+        <w:t>en</w:t>
+      </w:r>
+      <w:r>
+        <w:rPr>
+          <w:rFonts w:ascii="Arial" w:hAnsi="Arial" w:cs="Arial"/>
+          <w:b/>
+          <w:spacing w:val="-15"/>
+          <w:sz w:val="24"/>
+        </w:rPr>
+        <w:t xml:space="preserve"> </w:t>
+      </w:r>
+      <w:r>
+        <w:rPr>
+          <w:rFonts w:ascii="Arial" w:hAnsi="Arial" w:cs="Arial"/>
+          <w:b/>
+          <w:spacing w:val="-2"/>
+          <w:sz w:val="24"/>
+        </w:rPr>
+        <w:t>Sistemas</w:t>
+      </w:r>
+      <w:r>
+        <w:rPr>
+          <w:rFonts w:ascii="Arial" w:hAnsi="Arial" w:cs="Arial"/>
+          <w:b/>
+          <w:spacing w:val="-11"/>
+          <w:sz w:val="24"/>
+        </w:rPr>
+        <w:t xml:space="preserve"> </w:t>
+      </w:r>
+      <w:r>
+        <w:rPr>
+          <w:rFonts w:ascii="Arial" w:hAnsi="Arial" w:cs="Arial"/>
+          <w:b/>
+          <w:spacing w:val="-2"/>
+          <w:sz w:val="24"/>
+        </w:rPr>
+        <w:t xml:space="preserve">Computacionales. </w:t>
+      </w:r>
+      <w:r>
+        <w:rPr>
+          <w:rFonts w:ascii="Arial" w:hAnsi="Arial" w:cs="Arial"/>
+          <w:b/>
+          <w:sz w:val="24"/>
+        </w:rPr>
+        <w:t>Numero de control: 231260005</w:t>
+      </w:r>
+    </w:p>
+    <w:p>
+      <w:pPr>
+        <w:spacing w:line="499" w:lineRule="auto"/>
+        <w:ind w:left="523" w:right="3455"/>
+        <w:rPr>
+          <w:rFonts w:ascii="Arial" w:hAnsi="Arial" w:cs="Arial"/>
+          <w:b/>
+        </w:rPr>
+      </w:pPr>
+      <w:r>
+        <w:rPr>
+          <w:rFonts w:ascii="Arial" w:hAnsi="Arial" w:cs="Arial"/>
+          <w:b/>
+          <w:sz w:val="24"/>
+        </w:rPr>
+        <w:t>Nombre</w:t>
+      </w:r>
+      <w:r>
+        <w:rPr>
+          <w:rFonts w:ascii="Arial" w:hAnsi="Arial" w:cs="Arial"/>
+          <w:b/>
+          <w:spacing w:val="-8"/>
+          <w:sz w:val="24"/>
+        </w:rPr>
+        <w:t xml:space="preserve"> </w:t>
+      </w:r>
+      <w:r>
+        <w:rPr>
+          <w:rFonts w:ascii="Arial" w:hAnsi="Arial" w:cs="Arial"/>
+          <w:b/>
+          <w:sz w:val="24"/>
+        </w:rPr>
+        <w:t>del</w:t>
+      </w:r>
+      <w:r>
+        <w:rPr>
+          <w:rFonts w:ascii="Arial" w:hAnsi="Arial" w:cs="Arial"/>
+          <w:b/>
+          <w:spacing w:val="-8"/>
+          <w:sz w:val="24"/>
+        </w:rPr>
+        <w:t xml:space="preserve"> </w:t>
+      </w:r>
+      <w:r>
+        <w:rPr>
+          <w:rFonts w:ascii="Arial" w:hAnsi="Arial" w:cs="Arial"/>
+          <w:b/>
+          <w:sz w:val="24"/>
+        </w:rPr>
+        <w:t>alumno:</w:t>
+      </w:r>
+      <w:r>
+        <w:rPr>
+          <w:rFonts w:ascii="Arial" w:hAnsi="Arial" w:cs="Arial"/>
+          <w:b/>
+          <w:spacing w:val="-7"/>
+          <w:sz w:val="24"/>
+        </w:rPr>
+        <w:t xml:space="preserve"> </w:t>
+      </w:r>
+      <w:r>
+        <w:rPr>
+          <w:rFonts w:ascii="Arial" w:hAnsi="Arial" w:cs="Arial"/>
+          <w:b/>
           <w:sz w:val="22"/>
         </w:rPr>
+        <w:t>EDDI</w:t>
+      </w:r>
+      <w:r>
+        <w:rPr>
+          <w:rFonts w:ascii="Arial" w:hAnsi="Arial" w:cs="Arial"/>
+          <w:b/>
+          <w:spacing w:val="-6"/>
+          <w:sz w:val="22"/>
+        </w:rPr>
         <w:t xml:space="preserve"> </w:t>
       </w:r>
       <w:r>
@@ -240,16 +448,24 @@
           <w:b/>
           <w:sz w:val="22"/>
         </w:rPr>
-        <w:t>de</w:t>
-      </w:r>
-      <w:r>
-        <w:rPr>
-          <w:rFonts w:ascii="Arial" w:hAnsi="Arial" w:cs="Arial"/>
-          <w:b/>
-          <w:spacing w:val="-10"/>
+        <w:t>URIEL</w:t>
+      </w:r>
+      <w:r>
+        <w:rPr>
+          <w:rFonts w:ascii="Arial" w:hAnsi="Arial" w:cs="Arial"/>
+          <w:b/>
+          <w:spacing w:val="-8"/>
           <w:sz w:val="22"/>
         </w:rPr>
         <w:t xml:space="preserve"> </w:t>
+      </w:r>
+      <w:r>
+        <w:rPr>
+          <w:rFonts w:ascii="Arial" w:hAnsi="Arial" w:cs="Arial"/>
+          <w:b/>
+          <w:sz w:val="22"/>
+        </w:rPr>
+        <w:t xml:space="preserve">CASTILLO </w:t>
       </w:r>
       <w:r>
         <w:rPr>
@@ -258,229 +474,6 @@
           <w:spacing w:val="-2"/>
           <w:sz w:val="22"/>
         </w:rPr>
-        <w:t>telecomunicaciones</w:t>
-      </w:r>
-    </w:p>
-    <w:p>
-      <w:pPr>
-        <w:pStyle w:val="Textoindependiente"/>
-        <w:spacing w:before="24"/>
-        <w:rPr>
-          <w:rFonts w:ascii="Arial" w:hAnsi="Arial" w:cs="Arial"/>
-          <w:b/>
-          <w:sz w:val="24"/>
-        </w:rPr>
-      </w:pPr>
-    </w:p>
-    <w:p>
-      <w:pPr>
-        <w:spacing w:line="499" w:lineRule="auto"/>
-        <w:ind w:left="523" w:right="1751"/>
-        <w:rPr>
-          <w:rFonts w:ascii="Arial" w:hAnsi="Arial" w:cs="Arial"/>
-          <w:b/>
-          <w:sz w:val="24"/>
-        </w:rPr>
-      </w:pPr>
-      <w:r>
-        <w:rPr>
-          <w:rFonts w:ascii="Arial" w:hAnsi="Arial" w:cs="Arial"/>
-          <w:b/>
-          <w:spacing w:val="-2"/>
-          <w:sz w:val="24"/>
-        </w:rPr>
-        <w:t>Especialidad:</w:t>
-      </w:r>
-      <w:r>
-        <w:rPr>
-          <w:rFonts w:ascii="Arial" w:hAnsi="Arial" w:cs="Arial"/>
-          <w:b/>
-          <w:spacing w:val="-15"/>
-          <w:sz w:val="24"/>
-        </w:rPr>
-        <w:t xml:space="preserve"> </w:t>
-      </w:r>
-      <w:r>
-        <w:rPr>
-          <w:rFonts w:ascii="Arial" w:hAnsi="Arial" w:cs="Arial"/>
-          <w:b/>
-          <w:spacing w:val="-2"/>
-          <w:sz w:val="24"/>
-        </w:rPr>
-        <w:t>Ingeniería</w:t>
-      </w:r>
-      <w:r>
-        <w:rPr>
-          <w:rFonts w:ascii="Arial" w:hAnsi="Arial" w:cs="Arial"/>
-          <w:b/>
-          <w:spacing w:val="-11"/>
-          <w:sz w:val="24"/>
-        </w:rPr>
-        <w:t xml:space="preserve"> </w:t>
-      </w:r>
-      <w:r>
-        <w:rPr>
-          <w:rFonts w:ascii="Arial" w:hAnsi="Arial" w:cs="Arial"/>
-          <w:b/>
-          <w:spacing w:val="-2"/>
-          <w:sz w:val="24"/>
-        </w:rPr>
-        <w:t>en</w:t>
-      </w:r>
-      <w:r>
-        <w:rPr>
-          <w:rFonts w:ascii="Arial" w:hAnsi="Arial" w:cs="Arial"/>
-          <w:b/>
-          <w:spacing w:val="-15"/>
-          <w:sz w:val="24"/>
-        </w:rPr>
-        <w:t xml:space="preserve"> </w:t>
-      </w:r>
-      <w:r>
-        <w:rPr>
-          <w:rFonts w:ascii="Arial" w:hAnsi="Arial" w:cs="Arial"/>
-          <w:b/>
-          <w:spacing w:val="-2"/>
-          <w:sz w:val="24"/>
-        </w:rPr>
-        <w:t>Sistemas</w:t>
-      </w:r>
-      <w:r>
-        <w:rPr>
-          <w:rFonts w:ascii="Arial" w:hAnsi="Arial" w:cs="Arial"/>
-          <w:b/>
-          <w:spacing w:val="-11"/>
-          <w:sz w:val="24"/>
-        </w:rPr>
-        <w:t xml:space="preserve"> </w:t>
-      </w:r>
-      <w:r>
-        <w:rPr>
-          <w:rFonts w:ascii="Arial" w:hAnsi="Arial" w:cs="Arial"/>
-          <w:b/>
-          <w:spacing w:val="-2"/>
-          <w:sz w:val="24"/>
-        </w:rPr>
-        <w:t xml:space="preserve">Computacionales. </w:t>
-      </w:r>
-      <w:r>
-        <w:rPr>
-          <w:rFonts w:ascii="Arial" w:hAnsi="Arial" w:cs="Arial"/>
-          <w:b/>
-          <w:sz w:val="24"/>
-        </w:rPr>
-        <w:t>Numero de control: 231260005</w:t>
-      </w:r>
-    </w:p>
-    <w:p>
-      <w:pPr>
-        <w:spacing w:line="499" w:lineRule="auto"/>
-        <w:ind w:left="523" w:right="3455"/>
-        <w:rPr>
-          <w:rFonts w:ascii="Arial" w:hAnsi="Arial" w:cs="Arial"/>
-          <w:b/>
-        </w:rPr>
-      </w:pPr>
-      <w:r>
-        <w:rPr>
-          <w:rFonts w:ascii="Arial" w:hAnsi="Arial" w:cs="Arial"/>
-          <w:b/>
-          <w:sz w:val="24"/>
-        </w:rPr>
-        <w:t>Nombre</w:t>
-      </w:r>
-      <w:r>
-        <w:rPr>
-          <w:rFonts w:ascii="Arial" w:hAnsi="Arial" w:cs="Arial"/>
-          <w:b/>
-          <w:spacing w:val="-8"/>
-          <w:sz w:val="24"/>
-        </w:rPr>
-        <w:t xml:space="preserve"> </w:t>
-      </w:r>
-      <w:r>
-        <w:rPr>
-          <w:rFonts w:ascii="Arial" w:hAnsi="Arial" w:cs="Arial"/>
-          <w:b/>
-          <w:sz w:val="24"/>
-        </w:rPr>
-        <w:t>del</w:t>
-      </w:r>
-      <w:r>
-        <w:rPr>
-          <w:rFonts w:ascii="Arial" w:hAnsi="Arial" w:cs="Arial"/>
-          <w:b/>
-          <w:spacing w:val="-8"/>
-          <w:sz w:val="24"/>
-        </w:rPr>
-        <w:t xml:space="preserve"> </w:t>
-      </w:r>
-      <w:r>
-        <w:rPr>
-          <w:rFonts w:ascii="Arial" w:hAnsi="Arial" w:cs="Arial"/>
-          <w:b/>
-          <w:sz w:val="24"/>
-        </w:rPr>
-        <w:t>alumno:</w:t>
-      </w:r>
-      <w:r>
-        <w:rPr>
-          <w:rFonts w:ascii="Arial" w:hAnsi="Arial" w:cs="Arial"/>
-          <w:b/>
-          <w:spacing w:val="-7"/>
-          <w:sz w:val="24"/>
-        </w:rPr>
-        <w:t xml:space="preserve"> </w:t>
-      </w:r>
-      <w:r>
-        <w:rPr>
-          <w:rFonts w:ascii="Arial" w:hAnsi="Arial" w:cs="Arial"/>
-          <w:b/>
-          <w:sz w:val="22"/>
-        </w:rPr>
-        <w:t>EDDI</w:t>
-      </w:r>
-      <w:r>
-        <w:rPr>
-          <w:rFonts w:ascii="Arial" w:hAnsi="Arial" w:cs="Arial"/>
-          <w:b/>
-          <w:spacing w:val="-6"/>
-          <w:sz w:val="22"/>
-        </w:rPr>
-        <w:t xml:space="preserve"> </w:t>
-      </w:r>
-      <w:r>
-        <w:rPr>
-          <w:rFonts w:ascii="Arial" w:hAnsi="Arial" w:cs="Arial"/>
-          <w:b/>
-          <w:sz w:val="22"/>
-        </w:rPr>
-        <w:t>URIEL</w:t>
-      </w:r>
-      <w:r>
-        <w:rPr>
-          <w:rFonts w:ascii="Arial" w:hAnsi="Arial" w:cs="Arial"/>
-          <w:b/>
-          <w:spacing w:val="-8"/>
-          <w:sz w:val="22"/>
-        </w:rPr>
-        <w:t xml:space="preserve"> </w:t>
-      </w:r>
-      <w:r>
-        <w:rPr>
-          <w:rFonts w:ascii="Arial" w:hAnsi="Arial" w:cs="Arial"/>
-          <w:b/>
-          <w:sz w:val="22"/>
-        </w:rPr>
-        <w:t xml:space="preserve">CASTILLO </w:t>
-      </w:r>
-      <w:r>
-        <w:rPr>
-          <w:rFonts w:ascii="Arial" w:hAnsi="Arial" w:cs="Arial"/>
-          <w:b/>
-          <w:spacing w:val="-2"/>
-          <w:sz w:val="22"/>
-        </w:rPr>
         <w:t>SANCHEZ</w:t>
       </w:r>
     </w:p>
@@ -551,24 +544,7 @@
           <w:b/>
           <w:sz w:val="24"/>
         </w:rPr>
-        <w:t>DERLIN</w:t>
-      </w:r>
-      <w:r>
-        <w:rPr>
-          <w:rFonts w:ascii="Arial" w:hAnsi="Arial" w:cs="Arial"/>
-          <w:b/>
-          <w:spacing w:val="-15"/>
-          <w:sz w:val="24"/>
-        </w:rPr>
-        <w:t xml:space="preserve"> </w:t>
-      </w:r>
-      <w:r>
-        <w:rPr>
-          <w:rFonts w:ascii="Arial" w:hAnsi="Arial" w:cs="Arial"/>
-          <w:b/>
-          <w:sz w:val="24"/>
-        </w:rPr>
-        <w:t>ANAEL MANZANO GALVEZ</w:t>
+        <w:t>Francisco Javier Mingo Velázquez</w:t>
       </w:r>
     </w:p>
     <w:p>

</xml_diff>